<commit_message>
Changed NP Agreement format
</commit_message>
<xml_diff>
--- a/backend/DOCS/np_agreement.docx
+++ b/backend/DOCS/np_agreement.docx
@@ -2,1285 +2,6 @@
 <file path=word/document.xml><?xml version="1.0" encoding="utf-8"?>
 <w:document xmlns:wpc="http://schemas.microsoft.com/office/word/2010/wordprocessingCanvas" xmlns:cx="http://schemas.microsoft.com/office/drawing/2014/chartex" xmlns:cx1="http://schemas.microsoft.com/office/drawing/2015/9/8/chartex" xmlns:cx2="http://schemas.microsoft.com/office/drawing/2015/10/21/chartex" xmlns:cx3="http://schemas.microsoft.com/office/drawing/2016/5/9/chartex" xmlns:cx4="http://schemas.microsoft.com/office/drawing/2016/5/10/chartex" xmlns:cx5="http://schemas.microsoft.com/office/drawing/2016/5/11/chartex" xmlns:cx6="http://schemas.microsoft.com/office/drawing/2016/5/12/chartex" xmlns:cx7="http://schemas.microsoft.com/office/drawing/2016/5/13/chartex" xmlns:cx8="http://schemas.microsoft.com/office/drawing/2016/5/14/chartex" xmlns:mc="http://schemas.openxmlformats.org/markup-compatibility/2006" xmlns:aink="http://schemas.microsoft.com/office/drawing/2016/ink" xmlns:am3d="http://schemas.microsoft.com/office/drawing/2017/model3d" xmlns:o="urn:schemas-microsoft-com:office:office" xmlns:oel="http://schemas.microsoft.com/office/2019/extlst" xmlns:r="http://schemas.openxmlformats.org/officeDocument/2006/relationships" xmlns:m="http://schemas.openxmlformats.org/officeDocument/2006/math" xmlns:v="urn:schemas-microsoft-com:vml" xmlns:wp14="http://schemas.microsoft.com/office/word/2010/wordprocessingDrawing" xmlns:wp="http://schemas.openxmlformats.org/drawingml/2006/wordprocessingDrawing" xmlns:w10="urn:schemas-microsoft-com:office:word" xmlns:w="http://schemas.openxmlformats.org/wordprocessingml/2006/main" xmlns:w14="http://schemas.microsoft.com/office/word/2010/wordml" xmlns:w15="http://schemas.microsoft.com/office/word/2012/wordml" xmlns:w16cex="http://schemas.microsoft.com/office/word/2018/wordml/cex" xmlns:w16cid="http://schemas.microsoft.com/office/word/2016/wordml/cid" xmlns:w16="http://schemas.microsoft.com/office/word/2018/wordml" xmlns:w16du="http://schemas.microsoft.com/office/word/2023/wordml/word16du" xmlns:w16sdtdh="http://schemas.microsoft.com/office/word/2020/wordml/sdtdatahash" xmlns:w16sdtfl="http://schemas.microsoft.com/office/word/2024/wordml/sdtformatlock" xmlns:w16se="http://schemas.microsoft.com/office/word/2015/wordml/symex" xmlns:wpg="http://schemas.microsoft.com/office/word/2010/wordprocessingGroup" xmlns:wpi="http://schemas.microsoft.com/office/word/2010/wordprocessingInk" xmlns:wne="http://schemas.microsoft.com/office/word/2006/wordml" xmlns:wps="http://schemas.microsoft.com/office/word/2010/wordprocessingShape" mc:Ignorable="w14 w15 w16se w16cid w16 w16cex w16sdtdh w16sdtfl w16du wp14">
   <w:body>
-    <w:p>
-      <w:pPr>
-        <w:spacing w:before="72"/>
-        <w:ind w:left="84"/>
-        <w:jc w:val="center"/>
-        <w:rPr>
-          <w:b/>
-          <w:sz w:val="24"/>
-          <w:u w:val="single"/>
-        </w:rPr>
-      </w:pPr>
-    </w:p>
-    <w:p>
-      <w:pPr>
-        <w:spacing w:before="72"/>
-        <w:ind w:left="84"/>
-        <w:jc w:val="center"/>
-        <w:rPr>
-          <w:b/>
-          <w:sz w:val="24"/>
-          <w:u w:val="single"/>
-        </w:rPr>
-      </w:pPr>
-    </w:p>
-    <w:p>
-      <w:pPr>
-        <w:spacing w:before="72"/>
-        <w:ind w:left="84"/>
-        <w:jc w:val="center"/>
-        <w:rPr>
-          <w:b/>
-          <w:sz w:val="24"/>
-          <w:u w:val="single"/>
-        </w:rPr>
-      </w:pPr>
-    </w:p>
-    <w:p>
-      <w:pPr>
-        <w:spacing w:before="72"/>
-        <w:ind w:left="84"/>
-        <w:jc w:val="center"/>
-        <w:rPr>
-          <w:b/>
-          <w:sz w:val="24"/>
-          <w:u w:val="single"/>
-        </w:rPr>
-      </w:pPr>
-    </w:p>
-    <w:p>
-      <w:pPr>
-        <w:spacing w:before="72"/>
-        <w:ind w:left="84"/>
-        <w:jc w:val="center"/>
-        <w:rPr>
-          <w:b/>
-          <w:sz w:val="24"/>
-          <w:u w:val="single"/>
-        </w:rPr>
-      </w:pPr>
-    </w:p>
-    <w:p>
-      <w:pPr>
-        <w:spacing w:before="72"/>
-        <w:ind w:left="84"/>
-        <w:jc w:val="center"/>
-        <w:rPr>
-          <w:b/>
-          <w:sz w:val="24"/>
-          <w:u w:val="single"/>
-        </w:rPr>
-      </w:pPr>
-    </w:p>
-    <w:p>
-      <w:pPr>
-        <w:spacing w:before="72"/>
-        <w:ind w:left="84"/>
-        <w:jc w:val="center"/>
-        <w:rPr>
-          <w:b/>
-          <w:sz w:val="24"/>
-          <w:u w:val="single"/>
-        </w:rPr>
-      </w:pPr>
-    </w:p>
-    <w:p>
-      <w:pPr>
-        <w:spacing w:before="72"/>
-        <w:ind w:left="84"/>
-        <w:jc w:val="center"/>
-        <w:rPr>
-          <w:b/>
-          <w:sz w:val="24"/>
-          <w:u w:val="single"/>
-        </w:rPr>
-      </w:pPr>
-    </w:p>
-    <w:p>
-      <w:pPr>
-        <w:spacing w:before="72"/>
-        <w:ind w:left="84"/>
-        <w:jc w:val="center"/>
-        <w:rPr>
-          <w:b/>
-          <w:sz w:val="24"/>
-          <w:u w:val="single"/>
-        </w:rPr>
-      </w:pPr>
-    </w:p>
-    <w:p>
-      <w:pPr>
-        <w:spacing w:before="72"/>
-        <w:ind w:left="84"/>
-        <w:jc w:val="center"/>
-        <w:rPr>
-          <w:b/>
-          <w:sz w:val="24"/>
-          <w:u w:val="single"/>
-        </w:rPr>
-      </w:pPr>
-    </w:p>
-    <w:p>
-      <w:pPr>
-        <w:spacing w:before="72"/>
-        <w:ind w:left="84"/>
-        <w:jc w:val="center"/>
-        <w:rPr>
-          <w:b/>
-          <w:sz w:val="24"/>
-          <w:u w:val="single"/>
-        </w:rPr>
-      </w:pPr>
-    </w:p>
-    <w:p>
-      <w:pPr>
-        <w:spacing w:before="72"/>
-        <w:ind w:left="84"/>
-        <w:jc w:val="center"/>
-        <w:rPr>
-          <w:b/>
-          <w:sz w:val="24"/>
-          <w:u w:val="single"/>
-        </w:rPr>
-      </w:pPr>
-    </w:p>
-    <w:p>
-      <w:pPr>
-        <w:spacing w:before="72"/>
-        <w:ind w:left="84"/>
-        <w:jc w:val="center"/>
-        <w:rPr>
-          <w:b/>
-          <w:sz w:val="24"/>
-          <w:u w:val="single"/>
-        </w:rPr>
-      </w:pPr>
-    </w:p>
-    <w:p>
-      <w:pPr>
-        <w:spacing w:before="72"/>
-        <w:ind w:left="84"/>
-        <w:jc w:val="center"/>
-        <w:rPr>
-          <w:b/>
-          <w:sz w:val="24"/>
-          <w:u w:val="single"/>
-        </w:rPr>
-      </w:pPr>
-    </w:p>
-    <w:p>
-      <w:pPr>
-        <w:spacing w:before="72"/>
-        <w:ind w:left="84"/>
-        <w:jc w:val="center"/>
-        <w:rPr>
-          <w:b/>
-          <w:sz w:val="24"/>
-          <w:u w:val="single"/>
-        </w:rPr>
-      </w:pPr>
-    </w:p>
-    <w:p>
-      <w:pPr>
-        <w:spacing w:before="72"/>
-        <w:ind w:left="84"/>
-        <w:jc w:val="center"/>
-        <w:rPr>
-          <w:b/>
-          <w:sz w:val="24"/>
-          <w:u w:val="single"/>
-        </w:rPr>
-      </w:pPr>
-    </w:p>
-    <w:p>
-      <w:pPr>
-        <w:spacing w:before="72"/>
-        <w:ind w:left="84"/>
-        <w:jc w:val="center"/>
-        <w:rPr>
-          <w:b/>
-          <w:sz w:val="24"/>
-          <w:u w:val="single"/>
-        </w:rPr>
-      </w:pPr>
-    </w:p>
-    <w:p>
-      <w:pPr>
-        <w:spacing w:before="72"/>
-        <w:ind w:left="84"/>
-        <w:jc w:val="center"/>
-        <w:rPr>
-          <w:b/>
-          <w:sz w:val="24"/>
-          <w:u w:val="single"/>
-        </w:rPr>
-      </w:pPr>
-    </w:p>
-    <w:p>
-      <w:pPr>
-        <w:spacing w:before="72"/>
-        <w:ind w:left="84"/>
-        <w:jc w:val="center"/>
-        <w:rPr>
-          <w:b/>
-          <w:sz w:val="24"/>
-          <w:u w:val="single"/>
-        </w:rPr>
-      </w:pPr>
-    </w:p>
-    <w:p>
-      <w:pPr>
-        <w:spacing w:before="72"/>
-        <w:ind w:left="84"/>
-        <w:jc w:val="center"/>
-        <w:rPr>
-          <w:b/>
-          <w:sz w:val="24"/>
-          <w:u w:val="single"/>
-        </w:rPr>
-      </w:pPr>
-    </w:p>
-    <w:p>
-      <w:pPr>
-        <w:spacing w:before="72"/>
-        <w:ind w:left="84"/>
-        <w:jc w:val="center"/>
-        <w:rPr>
-          <w:b/>
-          <w:sz w:val="24"/>
-          <w:u w:val="single"/>
-        </w:rPr>
-      </w:pPr>
-    </w:p>
-    <w:p>
-      <w:pPr>
-        <w:spacing w:before="72"/>
-        <w:ind w:left="84"/>
-        <w:jc w:val="center"/>
-        <w:rPr>
-          <w:b/>
-          <w:sz w:val="24"/>
-          <w:u w:val="single"/>
-        </w:rPr>
-      </w:pPr>
-    </w:p>
-    <w:p>
-      <w:pPr>
-        <w:spacing w:before="72"/>
-        <w:ind w:left="84"/>
-        <w:jc w:val="center"/>
-        <w:rPr>
-          <w:b/>
-          <w:sz w:val="24"/>
-          <w:u w:val="single"/>
-        </w:rPr>
-      </w:pPr>
-    </w:p>
-    <w:p>
-      <w:pPr>
-        <w:spacing w:before="72"/>
-        <w:ind w:left="84"/>
-        <w:jc w:val="center"/>
-        <w:rPr>
-          <w:b/>
-          <w:sz w:val="24"/>
-          <w:u w:val="single"/>
-        </w:rPr>
-      </w:pPr>
-    </w:p>
-    <w:p>
-      <w:pPr>
-        <w:spacing w:before="72"/>
-        <w:ind w:left="84"/>
-        <w:jc w:val="center"/>
-        <w:rPr>
-          <w:b/>
-          <w:sz w:val="24"/>
-          <w:u w:val="single"/>
-        </w:rPr>
-      </w:pPr>
-    </w:p>
-    <w:p>
-      <w:pPr>
-        <w:spacing w:before="72"/>
-        <w:ind w:left="84"/>
-        <w:jc w:val="center"/>
-        <w:rPr>
-          <w:b/>
-          <w:sz w:val="24"/>
-          <w:u w:val="single"/>
-        </w:rPr>
-      </w:pPr>
-    </w:p>
-    <w:p>
-      <w:pPr>
-        <w:spacing w:before="72"/>
-        <w:ind w:left="84"/>
-        <w:jc w:val="center"/>
-        <w:rPr>
-          <w:b/>
-          <w:sz w:val="24"/>
-          <w:u w:val="single"/>
-        </w:rPr>
-      </w:pPr>
-    </w:p>
-    <w:p>
-      <w:pPr>
-        <w:spacing w:before="72"/>
-        <w:rPr>
-          <w:b/>
-          <w:sz w:val="24"/>
-          <w:u w:val="single"/>
-        </w:rPr>
-      </w:pPr>
-    </w:p>
-    <w:p>
-      <w:pPr>
-        <w:spacing w:before="72"/>
-        <w:ind w:left="84"/>
-        <w:jc w:val="center"/>
-        <w:rPr>
-          <w:b/>
-          <w:i/>
-          <w:iCs/>
-          <w:sz w:val="24"/>
-        </w:rPr>
-      </w:pPr>
-      <w:r>
-        <w:rPr>
-          <w:b/>
-          <w:sz w:val="24"/>
-          <w:u w:val="single"/>
-        </w:rPr>
-        <w:t>Model</w:t>
-      </w:r>
-      <w:r>
-        <w:rPr>
-          <w:b/>
-          <w:spacing w:val="-2"/>
-          <w:sz w:val="24"/>
-          <w:u w:val="single"/>
-        </w:rPr>
-        <w:t xml:space="preserve"> Agreement</w:t>
-      </w:r>
-    </w:p>
-    <w:p>
-      <w:pPr>
-        <w:pStyle w:val="BodyText"/>
-        <w:ind w:left="0"/>
-        <w:rPr>
-          <w:b/>
-        </w:rPr>
-      </w:pPr>
-    </w:p>
-    <w:p>
-      <w:pPr>
-        <w:ind w:left="81"/>
-        <w:jc w:val="center"/>
-        <w:rPr>
-          <w:b/>
-          <w:sz w:val="24"/>
-        </w:rPr>
-      </w:pPr>
-      <w:r>
-        <w:rPr>
-          <w:b/>
-          <w:spacing w:val="-2"/>
-          <w:sz w:val="24"/>
-          <w:u w:val="single"/>
-        </w:rPr>
-        <w:t>Between</w:t>
-      </w:r>
-    </w:p>
-    <w:p>
-      <w:pPr>
-        <w:pStyle w:val="BodyText"/>
-        <w:spacing w:before="1"/>
-        <w:ind w:left="0"/>
-        <w:rPr>
-          <w:b/>
-        </w:rPr>
-      </w:pPr>
-    </w:p>
-    <w:p>
-      <w:pPr>
-        <w:pStyle w:val="Heading2"/>
-        <w:ind w:left="274" w:right="186" w:hanging="11"/>
-        <w:jc w:val="left"/>
-      </w:pPr>
-      <w:r>
-        <w:t>Applicant and the registered/</w:t>
-      </w:r>
-      <w:proofErr w:type="spellStart"/>
-      <w:r>
-        <w:t>empanelled</w:t>
-      </w:r>
-      <w:proofErr w:type="spellEnd"/>
-      <w:r>
-        <w:t xml:space="preserve"> Vendor for installation of rooftop solar system in residential</w:t>
-      </w:r>
-      <w:r>
-        <w:t xml:space="preserve"> </w:t>
-      </w:r>
-      <w:r>
-        <w:t>house</w:t>
-      </w:r>
-      <w:r>
-        <w:t xml:space="preserve"> </w:t>
-      </w:r>
-      <w:r>
-        <w:t>of</w:t>
-      </w:r>
-      <w:r>
-        <w:t xml:space="preserve"> </w:t>
-      </w:r>
-      <w:r>
-        <w:t>the</w:t>
-      </w:r>
-      <w:r>
-        <w:t xml:space="preserve"> </w:t>
-      </w:r>
-      <w:r>
-        <w:t>Applicant</w:t>
-      </w:r>
-      <w:r>
-        <w:t xml:space="preserve"> </w:t>
-      </w:r>
-      <w:r>
-        <w:t>under</w:t>
-      </w:r>
-      <w:r>
-        <w:t xml:space="preserve"> </w:t>
-      </w:r>
-      <w:r>
-        <w:t>simplified</w:t>
-      </w:r>
-      <w:r>
-        <w:t xml:space="preserve"> </w:t>
-      </w:r>
-      <w:r>
-        <w:t>procedure</w:t>
-      </w:r>
-      <w:r>
-        <w:t xml:space="preserve"> </w:t>
-      </w:r>
-      <w:r>
-        <w:t>of</w:t>
-      </w:r>
-      <w:r>
-        <w:t xml:space="preserve"> </w:t>
-      </w:r>
-      <w:r>
-        <w:t>Rooftop</w:t>
-      </w:r>
-      <w:r>
-        <w:t xml:space="preserve"> </w:t>
-      </w:r>
-      <w:r>
-        <w:t>Solar</w:t>
-      </w:r>
-      <w:r>
-        <w:t xml:space="preserve"> </w:t>
-      </w:r>
-      <w:proofErr w:type="spellStart"/>
-      <w:r>
-        <w:t>Programme</w:t>
-      </w:r>
-      <w:proofErr w:type="spellEnd"/>
-      <w:r>
-        <w:t xml:space="preserve">  </w:t>
-      </w:r>
-      <w:r>
-        <w:t xml:space="preserve">Ph- </w:t>
-      </w:r>
-      <w:r>
-        <w:rPr>
-          <w:spacing w:val="-6"/>
-        </w:rPr>
-        <w:t>II</w:t>
-      </w:r>
-    </w:p>
-    <w:p>
-      <w:pPr>
-        <w:pStyle w:val="BodyText"/>
-        <w:spacing w:before="274"/>
-        <w:ind w:left="192" w:right="106"/>
-        <w:jc w:val="both"/>
-      </w:pPr>
-      <w:r>
-        <w:t>This</w:t>
-      </w:r>
-      <w:r>
-        <w:t xml:space="preserve"> </w:t>
-      </w:r>
-      <w:r>
-        <w:t>a</w:t>
-      </w:r>
-      <w:r>
-        <w:t>greement</w:t>
-      </w:r>
-      <w:r>
-        <w:t xml:space="preserve"> </w:t>
-      </w:r>
-      <w:r>
-        <w:t>is</w:t>
-      </w:r>
-      <w:r>
-        <w:t xml:space="preserve"> </w:t>
-      </w:r>
-      <w:r>
-        <w:t>executed</w:t>
-      </w:r>
-      <w:r>
-        <w:t xml:space="preserve"> </w:t>
-      </w:r>
-      <w:r>
-        <w:t>on</w:t>
-      </w:r>
-      <w:r>
-        <w:t xml:space="preserve"> </w:t>
-      </w:r>
-      <w:r>
-        <w:rPr>
-          <w:b/>
-          <w:bCs/>
-        </w:rPr>
-        <w:t>${CONSUMER_APP_DATE}$</w:t>
-      </w:r>
-      <w:r>
-        <w:rPr>
-          <w:b/>
-          <w:bCs/>
-        </w:rPr>
-        <w:t xml:space="preserve"> </w:t>
-      </w:r>
-      <w:r>
-        <w:t>for design</w:t>
-      </w:r>
-      <w:r>
-        <w:t>,</w:t>
-      </w:r>
-      <w:r>
-        <w:t xml:space="preserve"> </w:t>
-      </w:r>
-      <w:r>
-        <w:t xml:space="preserve">installation, </w:t>
-      </w:r>
-      <w:r>
-        <w:t>c</w:t>
-      </w:r>
-      <w:r>
-        <w:t>ommissioning</w:t>
-      </w:r>
-      <w:r>
-        <w:t xml:space="preserve"> </w:t>
-      </w:r>
-      <w:r>
-        <w:t>and</w:t>
-      </w:r>
-      <w:r>
-        <w:t xml:space="preserve"> </w:t>
-      </w:r>
-      <w:r>
-        <w:t>five</w:t>
-      </w:r>
-      <w:r>
-        <w:t xml:space="preserve"> </w:t>
-      </w:r>
-      <w:r>
-        <w:t>years</w:t>
-      </w:r>
-      <w:r>
-        <w:t xml:space="preserve"> </w:t>
-      </w:r>
-      <w:r>
-        <w:t>comprehensive</w:t>
-      </w:r>
-      <w:r>
-        <w:t xml:space="preserve"> </w:t>
-      </w:r>
-      <w:r>
-        <w:t>maintenance</w:t>
-      </w:r>
-      <w:r>
-        <w:t xml:space="preserve"> </w:t>
-      </w:r>
-      <w:r>
-        <w:t>of</w:t>
-      </w:r>
-      <w:r>
-        <w:t xml:space="preserve"> </w:t>
-      </w:r>
-      <w:r>
-        <w:t>rooftop</w:t>
-      </w:r>
-      <w:r>
-        <w:t xml:space="preserve"> </w:t>
-      </w:r>
-      <w:r>
-        <w:t>solar</w:t>
-      </w:r>
-      <w:r>
-        <w:t xml:space="preserve"> </w:t>
-      </w:r>
-      <w:r>
-        <w:t>system</w:t>
-      </w:r>
-      <w:r>
-        <w:t xml:space="preserve"> </w:t>
-      </w:r>
-      <w:r>
-        <w:t>to</w:t>
-      </w:r>
-      <w:r>
-        <w:t xml:space="preserve"> </w:t>
-      </w:r>
-      <w:r>
-        <w:t>be</w:t>
-      </w:r>
-      <w:r>
-        <w:t xml:space="preserve"> </w:t>
-      </w:r>
-      <w:r>
-        <w:t>installed</w:t>
-      </w:r>
-      <w:r>
-        <w:t xml:space="preserve"> </w:t>
-      </w:r>
-      <w:r>
-        <w:t xml:space="preserve">under simplified procedure of Rooftop Solar </w:t>
-      </w:r>
-      <w:proofErr w:type="spellStart"/>
-      <w:r>
-        <w:t>Programme</w:t>
-      </w:r>
-      <w:proofErr w:type="spellEnd"/>
-      <w:r>
-        <w:t xml:space="preserve"> Ph-II.</w:t>
-      </w:r>
-    </w:p>
-    <w:p>
-      <w:pPr>
-        <w:pStyle w:val="Heading2"/>
-      </w:pPr>
-      <w:r>
-        <w:rPr>
-          <w:spacing w:val="-2"/>
-        </w:rPr>
-        <w:t>Between</w:t>
-      </w:r>
-    </w:p>
-    <w:p>
-      <w:pPr>
-        <w:pStyle w:val="BodyText"/>
-        <w:tabs>
-          <w:tab w:val="left" w:pos="1519"/>
-          <w:tab w:val="left" w:pos="2222"/>
-          <w:tab w:val="left" w:pos="3428"/>
-          <w:tab w:val="left" w:pos="4436"/>
-          <w:tab w:val="left" w:pos="5244"/>
-          <w:tab w:val="left" w:pos="5704"/>
-          <w:tab w:val="left" w:pos="5811"/>
-          <w:tab w:val="left" w:pos="6032"/>
-          <w:tab w:val="left" w:pos="6773"/>
-          <w:tab w:val="left" w:pos="6988"/>
-          <w:tab w:val="left" w:pos="7899"/>
-          <w:tab w:val="left" w:pos="8573"/>
-          <w:tab w:val="left" w:pos="9156"/>
-          <w:tab w:val="left" w:pos="9942"/>
-        </w:tabs>
-        <w:ind w:left="0" w:right="108"/>
-        <w:rPr>
-          <w:spacing w:val="-4"/>
-        </w:rPr>
-      </w:pPr>
-      <w:r>
-        <w:rPr>
-          <w:b/>
-          <w:color w:val="2F2F2F"/>
-        </w:rPr>
-        <w:t xml:space="preserve"> </w:t>
-      </w:r>
-      <w:r>
-        <w:rPr>
-          <w:b/>
-          <w:color w:val="2F2F2F"/>
-        </w:rPr>
-        <w:t xml:space="preserve">  </w:t>
-      </w:r>
-      <w:r>
-        <w:rPr>
-          <w:b/>
-          <w:color w:val="2F2F2F"/>
-        </w:rPr>
-        <w:t>${CONSUMER_NAME}$</w:t>
-      </w:r>
-      <w:r>
-        <w:rPr>
-          <w:spacing w:val="-2"/>
-        </w:rPr>
-        <w:t xml:space="preserve"> </w:t>
-      </w:r>
-      <w:r>
-        <w:rPr>
-          <w:spacing w:val="-2"/>
-        </w:rPr>
-        <w:t>(Name</w:t>
-      </w:r>
-      <w:r>
-        <w:rPr>
-          <w:spacing w:val="-2"/>
-        </w:rPr>
-        <w:t xml:space="preserve"> </w:t>
-      </w:r>
-      <w:r>
-        <w:rPr>
-          <w:spacing w:val="-6"/>
-        </w:rPr>
-        <w:t>of</w:t>
-      </w:r>
-      <w:r>
-        <w:rPr>
-          <w:spacing w:val="-6"/>
-        </w:rPr>
-        <w:t xml:space="preserve"> </w:t>
-      </w:r>
-      <w:r>
-        <w:rPr>
-          <w:spacing w:val="-2"/>
-        </w:rPr>
-        <w:t>Applicant)</w:t>
-      </w:r>
-      <w:r>
-        <w:t xml:space="preserve"> </w:t>
-      </w:r>
-      <w:r>
-        <w:rPr>
-          <w:spacing w:val="-2"/>
-        </w:rPr>
-        <w:t>having</w:t>
-      </w:r>
-      <w:r>
-        <w:t xml:space="preserve">  </w:t>
-      </w:r>
-      <w:r>
-        <w:rPr>
-          <w:spacing w:val="-2"/>
-        </w:rPr>
-        <w:t>residential</w:t>
-      </w:r>
-      <w:r>
-        <w:t xml:space="preserve"> </w:t>
-      </w:r>
-      <w:r>
-        <w:rPr>
-          <w:spacing w:val="-2"/>
-        </w:rPr>
-        <w:t>electricity connection</w:t>
-      </w:r>
-      <w:r>
-        <w:t xml:space="preserve"> </w:t>
-      </w:r>
-      <w:r>
-        <w:rPr>
-          <w:spacing w:val="-4"/>
-        </w:rPr>
-        <w:t>with</w:t>
-      </w:r>
-      <w:r>
-        <w:rPr>
-          <w:spacing w:val="-4"/>
-        </w:rPr>
-        <w:t xml:space="preserve"> </w:t>
-      </w:r>
-      <w:r>
-        <w:rPr>
-          <w:spacing w:val="-4"/>
-        </w:rPr>
-        <w:t xml:space="preserve">        </w:t>
-      </w:r>
-    </w:p>
-    <w:p>
-      <w:pPr>
-        <w:pStyle w:val="BodyText"/>
-        <w:tabs>
-          <w:tab w:val="left" w:pos="1519"/>
-          <w:tab w:val="left" w:pos="2222"/>
-          <w:tab w:val="left" w:pos="3428"/>
-          <w:tab w:val="left" w:pos="4436"/>
-          <w:tab w:val="left" w:pos="5244"/>
-          <w:tab w:val="left" w:pos="5704"/>
-          <w:tab w:val="left" w:pos="5811"/>
-          <w:tab w:val="left" w:pos="6032"/>
-          <w:tab w:val="left" w:pos="6773"/>
-          <w:tab w:val="left" w:pos="6988"/>
-          <w:tab w:val="left" w:pos="7899"/>
-          <w:tab w:val="left" w:pos="8573"/>
-          <w:tab w:val="left" w:pos="9156"/>
-          <w:tab w:val="left" w:pos="9942"/>
-        </w:tabs>
-        <w:ind w:left="0" w:right="108"/>
-      </w:pPr>
-      <w:r>
-        <w:rPr>
-          <w:spacing w:val="-2"/>
-        </w:rPr>
-        <w:t xml:space="preserve">    </w:t>
-      </w:r>
-      <w:r>
-        <w:rPr>
-          <w:spacing w:val="-2"/>
-        </w:rPr>
-        <w:t>consumer</w:t>
-      </w:r>
-      <w:r>
-        <w:rPr>
-          <w:spacing w:val="-2"/>
-        </w:rPr>
-        <w:t xml:space="preserve"> </w:t>
-      </w:r>
-      <w:r>
-        <w:rPr>
-          <w:spacing w:val="-2"/>
-        </w:rPr>
-        <w:t>number</w:t>
-      </w:r>
-      <w:r>
-        <w:rPr>
-          <w:spacing w:val="-2"/>
-        </w:rPr>
-        <w:t xml:space="preserve"> </w:t>
-      </w:r>
-      <w:r>
-        <w:rPr>
-          <w:spacing w:val="-2"/>
-        </w:rPr>
-        <w:t>${CONSUMER_NO}$</w:t>
-      </w:r>
-      <w:r>
-        <w:rPr>
-          <w:b/>
-          <w:color w:val="2F2F2F"/>
-        </w:rPr>
-        <w:t xml:space="preserve"> </w:t>
-      </w:r>
-      <w:r>
-        <w:rPr>
-          <w:spacing w:val="-4"/>
-        </w:rPr>
-        <w:t>from</w:t>
-      </w:r>
-      <w:r>
-        <w:rPr>
-          <w:spacing w:val="-4"/>
-        </w:rPr>
-        <w:t xml:space="preserve"> MSEDCL </w:t>
-      </w:r>
-      <w:r>
-        <w:rPr>
-          <w:spacing w:val="-2"/>
-        </w:rPr>
-        <w:t>(DISCOM)</w:t>
-      </w:r>
-      <w:r>
-        <w:rPr>
-          <w:spacing w:val="-2"/>
-        </w:rPr>
-        <w:t xml:space="preserve"> </w:t>
-      </w:r>
-      <w:r>
-        <w:rPr>
-          <w:spacing w:val="-5"/>
-        </w:rPr>
-        <w:t>at</w:t>
-      </w:r>
-      <w:r>
-        <w:rPr>
-          <w:spacing w:val="-5"/>
-        </w:rPr>
-        <w:t xml:space="preserve"> </w:t>
-      </w:r>
-    </w:p>
-    <w:p>
-      <w:pPr>
-        <w:pStyle w:val="BodyText"/>
-        <w:tabs>
-          <w:tab w:val="left" w:pos="1519"/>
-          <w:tab w:val="left" w:pos="2222"/>
-          <w:tab w:val="left" w:pos="3428"/>
-          <w:tab w:val="left" w:pos="4436"/>
-          <w:tab w:val="left" w:pos="5244"/>
-          <w:tab w:val="left" w:pos="5704"/>
-          <w:tab w:val="left" w:pos="5811"/>
-          <w:tab w:val="left" w:pos="6032"/>
-          <w:tab w:val="left" w:pos="6773"/>
-          <w:tab w:val="left" w:pos="6988"/>
-          <w:tab w:val="left" w:pos="7899"/>
-          <w:tab w:val="left" w:pos="8573"/>
-          <w:tab w:val="left" w:pos="9156"/>
-          <w:tab w:val="left" w:pos="9942"/>
-        </w:tabs>
-        <w:ind w:left="192" w:right="108"/>
-      </w:pPr>
-      <w:r>
-        <w:rPr>
-          <w:b/>
-          <w:color w:val="2F2F2F"/>
-        </w:rPr>
-        <w:t xml:space="preserve"> </w:t>
-      </w:r>
-      <w:r>
-        <w:t>(here</w:t>
-      </w:r>
-      <w:r>
-        <w:t xml:space="preserve"> </w:t>
-      </w:r>
-      <w:r>
-        <w:t>in</w:t>
-      </w:r>
-      <w:r>
-        <w:t xml:space="preserve"> </w:t>
-      </w:r>
-      <w:r>
-        <w:t>after</w:t>
-      </w:r>
-      <w:r>
-        <w:t xml:space="preserve"> </w:t>
-      </w:r>
-      <w:r>
-        <w:t>referred</w:t>
-      </w:r>
-      <w:r>
-        <w:t xml:space="preserve"> </w:t>
-      </w:r>
-      <w:r>
-        <w:t>as</w:t>
-      </w:r>
-      <w:r>
-        <w:t xml:space="preserve"> </w:t>
-      </w:r>
-      <w:r>
-        <w:rPr>
-          <w:spacing w:val="-2"/>
-        </w:rPr>
-        <w:t>Applicant).</w:t>
-      </w:r>
-    </w:p>
-    <w:p>
-      <w:pPr>
-        <w:pStyle w:val="Heading2"/>
-        <w:ind w:left="86"/>
-      </w:pPr>
-      <w:r>
-        <w:rPr>
-          <w:spacing w:val="-5"/>
-        </w:rPr>
-        <w:t>And</w:t>
-      </w:r>
-    </w:p>
-    <w:p>
-      <w:pPr>
-        <w:pStyle w:val="BodyText"/>
-        <w:tabs>
-          <w:tab w:val="left" w:leader="dot" w:pos="5352"/>
-        </w:tabs>
-        <w:ind w:left="192"/>
-      </w:pPr>
-      <w:r>
-        <w:rPr>
-          <w:b/>
-          <w:bCs/>
-          <w:spacing w:val="-10"/>
-        </w:rPr>
-        <w:t>RAJLAXMI AGENCY</w:t>
-      </w:r>
-      <w:r>
-        <w:rPr>
-          <w:b/>
-          <w:bCs/>
-          <w:spacing w:val="-10"/>
-        </w:rPr>
-        <w:t xml:space="preserve"> </w:t>
-      </w:r>
-      <w:r>
-        <w:rPr>
-          <w:b/>
-          <w:bCs/>
-          <w:spacing w:val="-10"/>
-        </w:rPr>
-        <w:t xml:space="preserve"> </w:t>
-      </w:r>
-      <w:r>
-        <w:t>(Name</w:t>
-      </w:r>
-      <w:r>
-        <w:t xml:space="preserve"> </w:t>
-      </w:r>
-      <w:r>
-        <w:t>of</w:t>
-      </w:r>
-      <w:r>
-        <w:t xml:space="preserve"> </w:t>
-      </w:r>
-      <w:r>
-        <w:t>Vendor)</w:t>
-      </w:r>
-      <w:r>
-        <w:t xml:space="preserve"> </w:t>
-      </w:r>
-      <w:r>
-        <w:t>is</w:t>
-      </w:r>
-      <w:r>
-        <w:t xml:space="preserve"> </w:t>
-      </w:r>
-      <w:r>
-        <w:t>registered/</w:t>
-      </w:r>
-      <w:proofErr w:type="spellStart"/>
-      <w:r>
-        <w:t>empanelled</w:t>
-      </w:r>
-      <w:proofErr w:type="spellEnd"/>
-      <w:r>
-        <w:t xml:space="preserve"> </w:t>
-      </w:r>
-      <w:r>
-        <w:rPr>
-          <w:spacing w:val="-4"/>
-        </w:rPr>
-        <w:t>with</w:t>
-      </w:r>
-    </w:p>
-    <w:p>
-      <w:pPr>
-        <w:pStyle w:val="BodyText"/>
-        <w:tabs>
-          <w:tab w:val="left" w:pos="2155"/>
-        </w:tabs>
-        <w:ind w:left="192"/>
-      </w:pPr>
-      <w:r>
-        <w:t>T</w:t>
-      </w:r>
-      <w:r>
-        <w:t>he</w:t>
-      </w:r>
-      <w:r>
-        <w:t xml:space="preserve"> </w:t>
-      </w:r>
-      <w:r>
-        <w:rPr>
-          <w:b/>
-          <w:bCs/>
-        </w:rPr>
-        <w:t>MSEDCL</w:t>
-      </w:r>
-      <w:r>
-        <w:rPr>
-          <w:b/>
-          <w:bCs/>
-        </w:rPr>
-        <w:t xml:space="preserve"> </w:t>
-      </w:r>
-      <w:r>
-        <w:t>(here</w:t>
-      </w:r>
-      <w:r>
-        <w:t xml:space="preserve"> </w:t>
-      </w:r>
-      <w:r>
-        <w:t>in after</w:t>
-      </w:r>
-      <w:r>
-        <w:t xml:space="preserve"> </w:t>
-      </w:r>
-      <w:r>
-        <w:t>referred</w:t>
-      </w:r>
-      <w:r>
-        <w:t xml:space="preserve"> </w:t>
-      </w:r>
-      <w:r>
-        <w:t>as</w:t>
-      </w:r>
-      <w:r>
-        <w:t xml:space="preserve"> </w:t>
-      </w:r>
-      <w:r>
-        <w:t>DISCOM)</w:t>
-      </w:r>
-      <w:r>
-        <w:t xml:space="preserve"> </w:t>
-      </w:r>
-      <w:r>
-        <w:t>and</w:t>
-      </w:r>
-      <w:r>
-        <w:t xml:space="preserve"> </w:t>
-      </w:r>
-      <w:r>
-        <w:t>is</w:t>
-      </w:r>
-      <w:r>
-        <w:t xml:space="preserve"> </w:t>
-      </w:r>
-      <w:r>
-        <w:t>having</w:t>
-      </w:r>
-      <w:r>
-        <w:t xml:space="preserve"> r</w:t>
-      </w:r>
-      <w:r>
-        <w:t>egistered/functional</w:t>
-      </w:r>
-      <w:r>
-        <w:t xml:space="preserve"> </w:t>
-      </w:r>
-      <w:r>
-        <w:t>office</w:t>
-      </w:r>
-      <w:r>
-        <w:t xml:space="preserve"> </w:t>
-      </w:r>
-      <w:r>
-        <w:rPr>
-          <w:spacing w:val="-5"/>
-        </w:rPr>
-        <w:t>at</w:t>
-      </w:r>
-    </w:p>
-    <w:p>
-      <w:pPr>
-        <w:pStyle w:val="BodyText"/>
-        <w:tabs>
-          <w:tab w:val="left" w:leader="dot" w:pos="4572"/>
-        </w:tabs>
-        <w:ind w:left="192"/>
-      </w:pPr>
-      <w:r>
-        <w:rPr>
-          <w:b/>
-          <w:bCs/>
-          <w:spacing w:val="-10"/>
-        </w:rPr>
-        <w:t>${DISCOM_REGISTERED_OFFICE}$</w:t>
-      </w:r>
-      <w:r>
-        <w:rPr>
-          <w:b/>
-          <w:bCs/>
-          <w:spacing w:val="-10"/>
-        </w:rPr>
-        <w:t xml:space="preserve"> </w:t>
-      </w:r>
-      <w:r>
-        <w:rPr>
-          <w:b/>
-          <w:bCs/>
-          <w:spacing w:val="-10"/>
-        </w:rPr>
-        <w:t>(</w:t>
-      </w:r>
-      <w:r>
-        <w:t>here</w:t>
-      </w:r>
-      <w:r>
-        <w:t xml:space="preserve"> </w:t>
-      </w:r>
-      <w:r>
-        <w:t>in after</w:t>
-      </w:r>
-      <w:r>
-        <w:t xml:space="preserve"> </w:t>
-      </w:r>
-      <w:r>
-        <w:t>referred</w:t>
-      </w:r>
-      <w:r>
-        <w:t xml:space="preserve"> </w:t>
-      </w:r>
-      <w:r>
-        <w:t>as</w:t>
-      </w:r>
-      <w:r>
-        <w:t xml:space="preserve"> </w:t>
-      </w:r>
-      <w:r>
-        <w:rPr>
-          <w:spacing w:val="-2"/>
-        </w:rPr>
-        <w:t>Vendor).</w:t>
-      </w:r>
-    </w:p>
-    <w:p>
-      <w:pPr>
-        <w:pStyle w:val="BodyText"/>
-        <w:ind w:left="0"/>
-      </w:pPr>
-    </w:p>
-    <w:p>
-      <w:pPr>
-        <w:pStyle w:val="BodyText"/>
-        <w:ind w:left="192"/>
-      </w:pPr>
-      <w:r>
-        <w:t>Both</w:t>
-      </w:r>
-      <w:r>
-        <w:t xml:space="preserve"> </w:t>
-      </w:r>
-      <w:r>
-        <w:t>Applicant</w:t>
-      </w:r>
-      <w:r>
-        <w:t xml:space="preserve"> </w:t>
-      </w:r>
-      <w:r>
-        <w:t>and</w:t>
-      </w:r>
-      <w:r>
-        <w:t xml:space="preserve"> </w:t>
-      </w:r>
-      <w:r>
-        <w:t>the</w:t>
-      </w:r>
-      <w:r>
-        <w:t xml:space="preserve"> </w:t>
-      </w:r>
-      <w:r>
-        <w:t>Vendor</w:t>
-      </w:r>
-      <w:r>
-        <w:t xml:space="preserve"> </w:t>
-      </w:r>
-      <w:r>
-        <w:t>are</w:t>
-      </w:r>
-      <w:r>
-        <w:t xml:space="preserve"> </w:t>
-      </w:r>
-      <w:r>
-        <w:t>jointly</w:t>
-      </w:r>
-      <w:r>
-        <w:t xml:space="preserve"> </w:t>
-      </w:r>
-      <w:r>
-        <w:t>referred as</w:t>
-      </w:r>
-      <w:r>
-        <w:t xml:space="preserve"> </w:t>
-      </w:r>
-      <w:r>
-        <w:rPr>
-          <w:spacing w:val="-2"/>
-        </w:rPr>
-        <w:t>Parties.</w:t>
-      </w:r>
-    </w:p>
     <w:p>
       <w:pPr>
         <w:pStyle w:val="BodyText"/>
@@ -2294,8 +1015,16 @@
         <w:rPr>
           <w:sz w:val="24"/>
         </w:rPr>
-        <w:t>${SOLAR_CAPACITY}$</w:t>
-      </w:r>
+        <w:t>${SOLAR_</w:t>
+      </w:r>
+      <w:proofErr w:type="gramStart"/>
+      <w:r>
+        <w:rPr>
+          <w:sz w:val="24"/>
+        </w:rPr>
+        <w:t>CAPACITY}$</w:t>
+      </w:r>
+      <w:proofErr w:type="gramEnd"/>
       <w:r>
         <w:rPr>
           <w:sz w:val="24"/>
@@ -2545,8 +1274,16 @@
         <w:rPr>
           <w:sz w:val="24"/>
         </w:rPr>
-        <w:t>${PANEL_COMPANY}$</w:t>
-      </w:r>
+        <w:t>${PANEL_</w:t>
+      </w:r>
+      <w:proofErr w:type="gramStart"/>
+      <w:r>
+        <w:rPr>
+          <w:sz w:val="24"/>
+        </w:rPr>
+        <w:t>COMPANY}$</w:t>
+      </w:r>
+      <w:proofErr w:type="gramEnd"/>
       <w:r>
         <w:rPr>
           <w:sz w:val="24"/>
@@ -2569,8 +1306,16 @@
         <w:rPr>
           <w:sz w:val="24"/>
         </w:rPr>
-        <w:t>${TOTAL_PANEL_CAPACITY}$</w:t>
-      </w:r>
+        <w:t>${TOTAL_PANEL_</w:t>
+      </w:r>
+      <w:proofErr w:type="gramStart"/>
+      <w:r>
+        <w:rPr>
+          <w:sz w:val="24"/>
+        </w:rPr>
+        <w:t>CAPACITY}$</w:t>
+      </w:r>
+      <w:proofErr w:type="gramEnd"/>
       <w:r>
         <w:rPr>
           <w:b/>
@@ -2611,8 +1356,16 @@
         <w:rPr>
           <w:sz w:val="24"/>
         </w:rPr>
-        <w:t>${PANEL_WATT}$</w:t>
-      </w:r>
+        <w:t>${PANEL_</w:t>
+      </w:r>
+      <w:proofErr w:type="gramStart"/>
+      <w:r>
+        <w:rPr>
+          <w:sz w:val="24"/>
+        </w:rPr>
+        <w:t>WATT}$</w:t>
+      </w:r>
+      <w:proofErr w:type="gramEnd"/>
       <w:r>
         <w:rPr>
           <w:sz w:val="24"/>
@@ -2753,8 +1506,16 @@
         <w:rPr>
           <w:sz w:val="24"/>
         </w:rPr>
-        <w:t>${INVERTER_MAKE}$</w:t>
-      </w:r>
+        <w:t>${INVERTER_</w:t>
+      </w:r>
+      <w:proofErr w:type="gramStart"/>
+      <w:r>
+        <w:rPr>
+          <w:sz w:val="24"/>
+        </w:rPr>
+        <w:t>MAKE}$</w:t>
+      </w:r>
+      <w:proofErr w:type="gramEnd"/>
       <w:r>
         <w:rPr>
           <w:sz w:val="24"/>
@@ -2771,8 +1532,16 @@
         <w:rPr>
           <w:sz w:val="24"/>
         </w:rPr>
-        <w:t>${INVERTER_CAPACITY}$</w:t>
-      </w:r>
+        <w:t>${INVERTER_</w:t>
+      </w:r>
+      <w:proofErr w:type="gramStart"/>
+      <w:r>
+        <w:rPr>
+          <w:sz w:val="24"/>
+        </w:rPr>
+        <w:t>CAPACITY}$</w:t>
+      </w:r>
+      <w:proofErr w:type="gramEnd"/>
       <w:r>
         <w:rPr>
           <w:b/>
@@ -2805,8 +1574,16 @@
         <w:rPr>
           <w:sz w:val="24"/>
         </w:rPr>
-        <w:t>${INVERTER_CAPACITY}$</w:t>
-      </w:r>
+        <w:t>${INVERTER_</w:t>
+      </w:r>
+      <w:proofErr w:type="gramStart"/>
+      <w:r>
+        <w:rPr>
+          <w:sz w:val="24"/>
+        </w:rPr>
+        <w:t>CAPACITY}$</w:t>
+      </w:r>
+      <w:proofErr w:type="gramEnd"/>
       <w:r>
         <w:rPr>
           <w:b/>
@@ -3097,8 +1874,16 @@
         <w:rPr>
           <w:sz w:val="24"/>
         </w:rPr>
-        <w:t>${SYSTEM_COST}$</w:t>
-      </w:r>
+        <w:t>${SYSTEM_</w:t>
+      </w:r>
+      <w:proofErr w:type="gramStart"/>
+      <w:r>
+        <w:rPr>
+          <w:sz w:val="24"/>
+        </w:rPr>
+        <w:t>COST}$</w:t>
+      </w:r>
+      <w:proofErr w:type="gramEnd"/>
       <w:r>
         <w:rPr>
           <w:b/>
@@ -3913,6 +2698,7 @@
         <w:ind w:left="475" w:hanging="283"/>
         <w:jc w:val="left"/>
       </w:pPr>
+      <w:proofErr w:type="gramStart"/>
       <w:r>
         <w:lastRenderedPageBreak/>
         <w:t>REPRESENTATIONS</w:t>
@@ -3921,7 +2707,15 @@
         <w:t xml:space="preserve">  </w:t>
       </w:r>
       <w:r>
-        <w:t>MADE BY</w:t>
+        <w:t>MADE</w:t>
+      </w:r>
+      <w:proofErr w:type="gramEnd"/>
+      <w:r>
+        <w:t xml:space="preserve"> </w:t>
+      </w:r>
+      <w:proofErr w:type="gramStart"/>
+      <w:r>
+        <w:t>BY</w:t>
       </w:r>
       <w:r>
         <w:t xml:space="preserve">  </w:t>
@@ -3929,6 +2723,7 @@
       <w:r>
         <w:t>THE</w:t>
       </w:r>
+      <w:proofErr w:type="gramEnd"/>
       <w:r>
         <w:t xml:space="preserve">  </w:t>
       </w:r>
@@ -7147,12 +5942,14 @@
         </w:rPr>
         <w:t xml:space="preserve"> </w:t>
       </w:r>
+      <w:proofErr w:type="gramStart"/>
       <w:r>
         <w:rPr>
           <w:sz w:val="24"/>
         </w:rPr>
         <w:t>been</w:t>
       </w:r>
+      <w:proofErr w:type="gramEnd"/>
       <w:r>
         <w:rPr>
           <w:sz w:val="24"/>
@@ -7519,11 +6316,19 @@
         </w:rPr>
         <w:t xml:space="preserve"> </w:t>
       </w:r>
-      <w:r>
-        <w:rPr>
-          <w:sz w:val="24"/>
-        </w:rPr>
-        <w:t>System(or</w:t>
+      <w:proofErr w:type="gramStart"/>
+      <w:r>
+        <w:rPr>
+          <w:sz w:val="24"/>
+        </w:rPr>
+        <w:t>System(</w:t>
+      </w:r>
+      <w:proofErr w:type="gramEnd"/>
+      <w:r>
+        <w:rPr>
+          <w:sz w:val="24"/>
+        </w:rPr>
+        <w:t>or</w:t>
       </w:r>
       <w:r>
         <w:rPr>
@@ -7798,7 +6603,21 @@
         <w:rPr>
           <w:sz w:val="24"/>
         </w:rPr>
-        <w:t>Subject to manufacturer warranty, Vendor warrants that the solar modules supplied herein shall have tolerance within a five percentage range (+/-5%). The peak-power point voltage and the peak-power point current of any supplied solar module and/or any module string (series</w:t>
+        <w:t xml:space="preserve">Subject to manufacturer warranty, Vendor warrants that the solar modules supplied herein shall have tolerance within a </w:t>
+      </w:r>
+      <w:proofErr w:type="gramStart"/>
+      <w:r>
+        <w:rPr>
+          <w:sz w:val="24"/>
+        </w:rPr>
+        <w:t>five percentage</w:t>
+      </w:r>
+      <w:proofErr w:type="gramEnd"/>
+      <w:r>
+        <w:rPr>
+          <w:sz w:val="24"/>
+        </w:rPr>
+        <w:t xml:space="preserve"> range (+/-5%). The peak-power point voltage and the peak-power point current of any supplied solar module and/or any module string (series</w:t>
       </w:r>
       <w:r>
         <w:rPr>
@@ -8966,6 +7785,7 @@
         <w:t xml:space="preserve"> </w:t>
       </w:r>
       <w:proofErr w:type="spellStart"/>
+      <w:proofErr w:type="gramStart"/>
       <w:r>
         <w:rPr>
           <w:sz w:val="24"/>
@@ -8973,6 +7793,7 @@
         <w:t>it’s</w:t>
       </w:r>
       <w:proofErr w:type="spellEnd"/>
+      <w:proofErr w:type="gramEnd"/>
       <w:r>
         <w:rPr>
           <w:sz w:val="24"/>
@@ -9697,6 +8518,7 @@
         </w:rPr>
         <w:t xml:space="preserve"> </w:t>
       </w:r>
+      <w:proofErr w:type="gramStart"/>
       <w:r>
         <w:rPr>
           <w:sz w:val="24"/>
@@ -9715,6 +8537,7 @@
         </w:rPr>
         <w:t>,including</w:t>
       </w:r>
+      <w:proofErr w:type="gramEnd"/>
       <w:r>
         <w:rPr>
           <w:sz w:val="24"/>
@@ -10710,6 +9533,7 @@
         </w:rPr>
         <w:t xml:space="preserve"> </w:t>
       </w:r>
+      <w:proofErr w:type="gramStart"/>
       <w:r>
         <w:rPr>
           <w:sz w:val="24"/>
@@ -10726,7 +9550,14 @@
         <w:rPr>
           <w:sz w:val="24"/>
         </w:rPr>
-        <w:t xml:space="preserve"> may, in addition to its other rights under this Agreement, suspend its obligations under this Agreement until all outstanding amounts (including interest due) are paid.</w:t>
+        <w:t xml:space="preserve"> may</w:t>
+      </w:r>
+      <w:proofErr w:type="gramEnd"/>
+      <w:r>
+        <w:rPr>
+          <w:sz w:val="24"/>
+        </w:rPr>
+        <w:t>, in addition to its other rights under this Agreement, suspend its obligations under this Agreement until all outstanding amounts (including interest due) are paid.</w:t>
       </w:r>
     </w:p>
     <w:p>
@@ -11505,13 +10336,27 @@
         <w:rPr>
           <w:sz w:val="24"/>
         </w:rPr>
-        <w:t xml:space="preserve"> C</w:t>
-      </w:r>
-      <w:r>
-        <w:rPr>
-          <w:sz w:val="24"/>
-        </w:rPr>
-        <w:t>orrelating to this Agreement (“</w:t>
+        <w:t xml:space="preserve"> </w:t>
+      </w:r>
+      <w:proofErr w:type="gramStart"/>
+      <w:r>
+        <w:rPr>
+          <w:sz w:val="24"/>
+        </w:rPr>
+        <w:t>C</w:t>
+      </w:r>
+      <w:r>
+        <w:rPr>
+          <w:sz w:val="24"/>
+        </w:rPr>
+        <w:t>orrelating</w:t>
+      </w:r>
+      <w:proofErr w:type="gramEnd"/>
+      <w:r>
+        <w:rPr>
+          <w:sz w:val="24"/>
+        </w:rPr>
+        <w:t xml:space="preserve"> to this Agreement (“</w:t>
       </w:r>
       <w:r>
         <w:rPr>
@@ -11783,8 +10628,16 @@
         <w:rPr>
           <w:spacing w:val="-2"/>
         </w:rPr>
-        <w:t>${CUSTOMER_PHOTO}$</w:t>
-      </w:r>
+        <w:t>${CUSTOMER_</w:t>
+      </w:r>
+      <w:proofErr w:type="gramStart"/>
+      <w:r>
+        <w:rPr>
+          <w:spacing w:val="-2"/>
+        </w:rPr>
+        <w:t>PHOTO}$</w:t>
+      </w:r>
+      <w:proofErr w:type="gramEnd"/>
     </w:p>
     <w:p>
       <w:pPr>
@@ -11813,8 +10666,16 @@
         <w:rPr>
           <w:spacing w:val="-2"/>
         </w:rPr>
-        <w:t>${CUSTOMER_SIGN}$</w:t>
-      </w:r>
+        <w:t>${CUSTOMER_</w:t>
+      </w:r>
+      <w:proofErr w:type="gramStart"/>
+      <w:r>
+        <w:rPr>
+          <w:spacing w:val="-2"/>
+        </w:rPr>
+        <w:t>SIGN}$</w:t>
+      </w:r>
+      <w:proofErr w:type="gramEnd"/>
     </w:p>
     <w:p>
       <w:pPr>
@@ -12990,6 +11851,7 @@
   <w:style w:type="character" w:default="1" w:styleId="DefaultParagraphFont">
     <w:name w:val="Default Paragraph Font"/>
     <w:uiPriority w:val="1"/>
+    <w:semiHidden/>
     <w:unhideWhenUsed/>
   </w:style>
   <w:style w:type="table" w:default="1" w:styleId="TableNormal">

</xml_diff>